<commit_message>
docs: add Tracker Data Quality (missing rows) section to biweekly report
Simple + detailed breakdown of the dashboard-vs-sheet mismatch: digital
total 7 vs 8 logged rows (cancelled row dropped by formula), Ready 3 vs 2
(Creative row has hard-typed values instead of COUNTIFS), In Progress 3 vs 4,
and the two leftover sample rows still counted. Regenerated .md/.docx/.pdf.
</commit_message>
<xml_diff>
--- a/daily logs/Biweekly Report (October 5 - October 17, 2026).docx
+++ b/daily logs/Biweekly Report (October 5 - October 17, 2026).docx
@@ -3910,7 +3910,7 @@
                 <w:b w:val="0"/>
                 <w:sz w:val="16"/>
               </w:rPr>
-              <w:t>No lead attribution; dashboard total (7) lags the 8 item rows</w:t>
+              <w:t>No lead attribution; dashboard counts do not reconcile with the sheet (see Tracker Data Quality)</w:t>
             </w:r>
           </w:p>
         </w:tc>
@@ -3928,7 +3928,441 @@
                 <w:b w:val="0"/>
                 <w:sz w:val="16"/>
               </w:rPr>
-              <w:t>Content ROI unmeasurable; tracker needs a recalc</w:t>
+              <w:t>Content ROI unmeasurable; tracker needs a fix</w:t>
+            </w:r>
+          </w:p>
+        </w:tc>
+      </w:tr>
+    </w:tbl>
+    <w:p>
+      <w:pPr>
+        <w:spacing w:before="160" w:after="60"/>
+      </w:pPr>
+      <w:r>
+        <w:rPr>
+          <w:b/>
+          <w:color w:val="006569"/>
+          <w:sz w:val="21"/>
+        </w:rPr>
+        <w:t>TRACKER DATA QUALITY - MISSING ROWS</w:t>
+      </w:r>
+    </w:p>
+    <w:p>
+      <w:pPr>
+        <w:spacing w:after="40"/>
+      </w:pPr>
+      <w:r>
+        <w:rPr>
+          <w:b/>
+          <w:sz w:val="16"/>
+        </w:rPr>
+        <w:t xml:space="preserve">Simple: </w:t>
+      </w:r>
+      <w:r>
+        <w:rPr>
+          <w:sz w:val="16"/>
+        </w:rPr>
+        <w:t>The dashboard does not match the sheet — it shows 7 digital items but 8 rows are logged, and ‘Ready’ is one too high. The two leftover sample rows (WEB-001, DC-001) are still being counted. Fix the sheet before the next report so the numbers can be trusted.</w:t>
+      </w:r>
+    </w:p>
+    <w:p>
+      <w:pPr>
+        <w:spacing w:after="40"/>
+      </w:pPr>
+      <w:r>
+        <w:rPr>
+          <w:b/>
+          <w:sz w:val="16"/>
+        </w:rPr>
+        <w:t>Detailed:</w:t>
+      </w:r>
+    </w:p>
+    <w:tbl>
+      <w:tblPr>
+        <w:tblStyle w:val="TableGrid"/>
+        <w:tblW w:type="auto" w:w="0"/>
+        <w:tblLook w:firstColumn="1" w:firstRow="1" w:lastColumn="0" w:lastRow="0" w:noHBand="0" w:noVBand="1" w:val="04A0"/>
+      </w:tblPr>
+      <w:tblGrid>
+        <w:gridCol w:w="2664"/>
+        <w:gridCol w:w="2664"/>
+        <w:gridCol w:w="2664"/>
+        <w:gridCol w:w="2664"/>
+      </w:tblGrid>
+      <w:tr>
+        <w:tc>
+          <w:tcPr>
+            <w:tcW w:type="dxa" w:w="510"/>
+            <w:shd w:val="clear" w:color="auto" w:fill="006569"/>
+          </w:tcPr>
+          <w:p>
+            <w:pPr>
+              <w:spacing w:after="0" w:before="0"/>
+            </w:pPr>
+            <w:r/>
+            <w:r>
+              <w:rPr>
+                <w:b/>
+                <w:color w:val="FFFFFF"/>
+                <w:sz w:val="16"/>
+              </w:rPr>
+              <w:t>#</w:t>
+            </w:r>
+          </w:p>
+        </w:tc>
+        <w:tc>
+          <w:tcPr>
+            <w:tcW w:type="dxa" w:w="3175"/>
+            <w:shd w:val="clear" w:color="auto" w:fill="006569"/>
+          </w:tcPr>
+          <w:p>
+            <w:pPr>
+              <w:spacing w:after="0" w:before="0"/>
+            </w:pPr>
+            <w:r/>
+            <w:r>
+              <w:rPr>
+                <w:b/>
+                <w:color w:val="FFFFFF"/>
+                <w:sz w:val="16"/>
+              </w:rPr>
+              <w:t>What the dashboard shows</w:t>
+            </w:r>
+          </w:p>
+        </w:tc>
+        <w:tc>
+          <w:tcPr>
+            <w:tcW w:type="dxa" w:w="3175"/>
+            <w:shd w:val="clear" w:color="auto" w:fill="006569"/>
+          </w:tcPr>
+          <w:p>
+            <w:pPr>
+              <w:spacing w:after="0" w:before="0"/>
+            </w:pPr>
+            <w:r/>
+            <w:r>
+              <w:rPr>
+                <w:b/>
+                <w:color w:val="FFFFFF"/>
+                <w:sz w:val="16"/>
+              </w:rPr>
+              <w:t>What the sheet actually has</w:t>
+            </w:r>
+          </w:p>
+        </w:tc>
+        <w:tc>
+          <w:tcPr>
+            <w:tcW w:type="dxa" w:w="3628"/>
+            <w:shd w:val="clear" w:color="auto" w:fill="006569"/>
+          </w:tcPr>
+          <w:p>
+            <w:pPr>
+              <w:spacing w:after="0" w:before="0"/>
+            </w:pPr>
+            <w:r/>
+            <w:r>
+              <w:rPr>
+                <w:b/>
+                <w:color w:val="FFFFFF"/>
+                <w:sz w:val="16"/>
+              </w:rPr>
+              <w:t>Fix</w:t>
+            </w:r>
+          </w:p>
+        </w:tc>
+      </w:tr>
+      <w:tr>
+        <w:tc>
+          <w:tcPr>
+            <w:tcW w:type="dxa" w:w="510"/>
+          </w:tcPr>
+          <w:p>
+            <w:pPr>
+              <w:spacing w:after="0" w:before="0"/>
+            </w:pPr>
+            <w:r/>
+            <w:r>
+              <w:rPr>
+                <w:b w:val="0"/>
+                <w:sz w:val="16"/>
+              </w:rPr>
+              <w:t>1</w:t>
+            </w:r>
+          </w:p>
+        </w:tc>
+        <w:tc>
+          <w:tcPr>
+            <w:tcW w:type="dxa" w:w="3175"/>
+          </w:tcPr>
+          <w:p>
+            <w:pPr>
+              <w:spacing w:after="0" w:before="0"/>
+            </w:pPr>
+            <w:r/>
+            <w:r>
+              <w:rPr>
+                <w:b w:val="0"/>
+                <w:sz w:val="16"/>
+              </w:rPr>
+              <w:t>Digital total = 7</w:t>
+            </w:r>
+          </w:p>
+        </w:tc>
+        <w:tc>
+          <w:tcPr>
+            <w:tcW w:type="dxa" w:w="3175"/>
+          </w:tcPr>
+          <w:p>
+            <w:pPr>
+              <w:spacing w:after="0" w:before="0"/>
+            </w:pPr>
+            <w:r/>
+            <w:r>
+              <w:rPr>
+                <w:b w:val="0"/>
+                <w:sz w:val="16"/>
+              </w:rPr>
+              <w:t>8 rows logged (DC-001 to DC-008)</w:t>
+            </w:r>
+          </w:p>
+        </w:tc>
+        <w:tc>
+          <w:tcPr>
+            <w:tcW w:type="dxa" w:w="3628"/>
+          </w:tcPr>
+          <w:p>
+            <w:pPr>
+              <w:spacing w:after="0" w:before="0"/>
+            </w:pPr>
+            <w:r/>
+            <w:r>
+              <w:rPr>
+                <w:b w:val="0"/>
+                <w:sz w:val="16"/>
+              </w:rPr>
+              <w:t>The Total formula counts only non-Cancelled rows, so DC-003 (Cancelled) is silently dropped — label the column ‘Active’ or count every row.</w:t>
+            </w:r>
+          </w:p>
+        </w:tc>
+      </w:tr>
+      <w:tr>
+        <w:tc>
+          <w:tcPr>
+            <w:tcW w:type="dxa" w:w="510"/>
+          </w:tcPr>
+          <w:p>
+            <w:pPr>
+              <w:spacing w:after="0" w:before="0"/>
+            </w:pPr>
+            <w:r/>
+            <w:r>
+              <w:rPr>
+                <w:b w:val="0"/>
+                <w:sz w:val="16"/>
+              </w:rPr>
+              <w:t>2</w:t>
+            </w:r>
+          </w:p>
+        </w:tc>
+        <w:tc>
+          <w:tcPr>
+            <w:tcW w:type="dxa" w:w="3175"/>
+          </w:tcPr>
+          <w:p>
+            <w:pPr>
+              <w:spacing w:after="0" w:before="0"/>
+            </w:pPr>
+            <w:r/>
+            <w:r>
+              <w:rPr>
+                <w:b w:val="0"/>
+                <w:sz w:val="16"/>
+              </w:rPr>
+              <w:t>Digital ‘Ready’ = 3</w:t>
+            </w:r>
+          </w:p>
+        </w:tc>
+        <w:tc>
+          <w:tcPr>
+            <w:tcW w:type="dxa" w:w="3175"/>
+          </w:tcPr>
+          <w:p>
+            <w:pPr>
+              <w:spacing w:after="0" w:before="0"/>
+            </w:pPr>
+            <w:r/>
+            <w:r>
+              <w:rPr>
+                <w:b w:val="0"/>
+                <w:sz w:val="16"/>
+              </w:rPr>
+              <w:t>2 rows (DC-005, DC-007)</w:t>
+            </w:r>
+          </w:p>
+        </w:tc>
+        <w:tc>
+          <w:tcPr>
+            <w:tcW w:type="dxa" w:w="3628"/>
+          </w:tcPr>
+          <w:p>
+            <w:pPr>
+              <w:spacing w:after="0" w:before="0"/>
+            </w:pPr>
+            <w:r/>
+            <w:r>
+              <w:rPr>
+                <w:b w:val="0"/>
+                <w:sz w:val="16"/>
+              </w:rPr>
+              <w:t>The ‘Creative’ row has a hard-typed 1 instead of the Ready formula every other row uses — replace it.</w:t>
+            </w:r>
+          </w:p>
+        </w:tc>
+      </w:tr>
+      <w:tr>
+        <w:tc>
+          <w:tcPr>
+            <w:tcW w:type="dxa" w:w="510"/>
+          </w:tcPr>
+          <w:p>
+            <w:pPr>
+              <w:spacing w:after="0" w:before="0"/>
+            </w:pPr>
+            <w:r/>
+            <w:r>
+              <w:rPr>
+                <w:b w:val="0"/>
+                <w:sz w:val="16"/>
+              </w:rPr>
+              <w:t>3</w:t>
+            </w:r>
+          </w:p>
+        </w:tc>
+        <w:tc>
+          <w:tcPr>
+            <w:tcW w:type="dxa" w:w="3175"/>
+          </w:tcPr>
+          <w:p>
+            <w:pPr>
+              <w:spacing w:after="0" w:before="0"/>
+            </w:pPr>
+            <w:r/>
+            <w:r>
+              <w:rPr>
+                <w:b w:val="0"/>
+                <w:sz w:val="16"/>
+              </w:rPr>
+              <w:t>Digital ‘In Progress / Planned’ = 3</w:t>
+            </w:r>
+          </w:p>
+        </w:tc>
+        <w:tc>
+          <w:tcPr>
+            <w:tcW w:type="dxa" w:w="3175"/>
+          </w:tcPr>
+          <w:p>
+            <w:pPr>
+              <w:spacing w:after="0" w:before="0"/>
+            </w:pPr>
+            <w:r/>
+            <w:r>
+              <w:rPr>
+                <w:b w:val="0"/>
+                <w:sz w:val="16"/>
+              </w:rPr>
+              <w:t>4 rows (DC-002, DC-004, DC-006, DC-008)</w:t>
+            </w:r>
+          </w:p>
+        </w:tc>
+        <w:tc>
+          <w:tcPr>
+            <w:tcW w:type="dxa" w:w="3628"/>
+          </w:tcPr>
+          <w:p>
+            <w:pPr>
+              <w:spacing w:after="0" w:before="0"/>
+            </w:pPr>
+            <w:r/>
+            <w:r>
+              <w:rPr>
+                <w:b w:val="0"/>
+                <w:sz w:val="16"/>
+              </w:rPr>
+              <w:t>Same row — set it to =Total - Posted - Ready (the formula the other rows use).</w:t>
+            </w:r>
+          </w:p>
+        </w:tc>
+      </w:tr>
+      <w:tr>
+        <w:tc>
+          <w:tcPr>
+            <w:tcW w:type="dxa" w:w="510"/>
+          </w:tcPr>
+          <w:p>
+            <w:pPr>
+              <w:spacing w:after="0" w:before="0"/>
+            </w:pPr>
+            <w:r/>
+            <w:r>
+              <w:rPr>
+                <w:b w:val="0"/>
+                <w:sz w:val="16"/>
+              </w:rPr>
+              <w:t>4</w:t>
+            </w:r>
+          </w:p>
+        </w:tc>
+        <w:tc>
+          <w:tcPr>
+            <w:tcW w:type="dxa" w:w="3175"/>
+          </w:tcPr>
+          <w:p>
+            <w:pPr>
+              <w:spacing w:after="0" w:before="0"/>
+            </w:pPr>
+            <w:r/>
+            <w:r>
+              <w:rPr>
+                <w:b w:val="0"/>
+                <w:sz w:val="16"/>
+              </w:rPr>
+              <w:t>Sample rows counted in the totals</w:t>
+            </w:r>
+          </w:p>
+        </w:tc>
+        <w:tc>
+          <w:tcPr>
+            <w:tcW w:type="dxa" w:w="3175"/>
+          </w:tcPr>
+          <w:p>
+            <w:pPr>
+              <w:spacing w:after="0" w:before="0"/>
+            </w:pPr>
+            <w:r/>
+            <w:r>
+              <w:rPr>
+                <w:b w:val="0"/>
+                <w:sz w:val="16"/>
+              </w:rPr>
+              <w:t>WEB-001 and DC-001 are marked ‘Example row’</w:t>
+            </w:r>
+          </w:p>
+        </w:tc>
+        <w:tc>
+          <w:tcPr>
+            <w:tcW w:type="dxa" w:w="3628"/>
+          </w:tcPr>
+          <w:p>
+            <w:pPr>
+              <w:spacing w:after="0" w:before="0"/>
+            </w:pPr>
+            <w:r/>
+            <w:r>
+              <w:rPr>
+                <w:b w:val="0"/>
+                <w:sz w:val="16"/>
+              </w:rPr>
+              <w:t>Delete both sample rows, then recalculate the sheet.</w:t>
             </w:r>
           </w:p>
         </w:tc>
@@ -4607,7 +5041,7 @@
                 <w:b w:val="0"/>
                 <w:sz w:val="16"/>
               </w:rPr>
-              <w:t>Refresh the tracker dashboard so its totals match the item rows</w:t>
+              <w:t>Fix the tracker dashboard (missing rows) so its totals match the item rows</w:t>
             </w:r>
           </w:p>
         </w:tc>

</xml_diff>